<commit_message>
docs(fase-2): ajustes del guion de Martín tras el QA de la demo
- Sin modo presentación: en ese modo desaparece la franja, que tiene
  "Abrir como Rosa" y el PIN de la escena 11.
- Escena 10: el PIN se ve en pantalla y es siempre 4821. En la franja
  aparece recién en la escena 11.
- Escena 11: bajar con la rueda del mouse antes de señalar el aviso
  "Tus datos en MATU", que a 1280x720 queda bajo el borde.
- Escena 16: exportar la lista solo se dice, porque el botón está en la
  escena 20.

Los tiempos no cambian (demo de 3:45). La nota de la lámina 15 del .pptx
sale del mismo texto.

Co-Authored-By: Claude Opus 5.5 <noreply@anthropic.com>
</commit_message>
<xml_diff>
--- a/Fase 2/Evidencias Proyecto/Guion_Martin_Fase2.docx
+++ b/Fase 2/Evidencias Proyecto/Guion_Martin_Fase2.docx
@@ -323,7 +323,27 @@
         <w:spacing w:after="60" w:line="290"/>
       </w:pPr>
       <w:r>
-        <w:t xml:space="preserve">Demo abierta en el computador que proyecta, con tema claro. En la guía, «Reiniciar demo». Después «p» para el modo presentación.</w:t>
+        <w:t xml:space="preserve">Demo abierta en el computador que proyecta, con tema claro. En la guía, «Reiniciar demo».</w:t>
+      </w:r>
+    </w:p>
+    <w:p>
+      <w:pPr>
+        <w:pStyle w:val="ListParagraph"/>
+        <w:numPr>
+          <w:ilvl w:val="0"/>
+          <w:numId w:val="2"/>
+        </w:numPr>
+        <w:spacing w:after="60" w:line="290"/>
+      </w:pPr>
+      <w:r>
+        <w:rPr>
+          <w:b/>
+          <w:bCs/>
+        </w:rPr>
+        <w:t xml:space="preserve">No uses el modo presentación («p»). </w:t>
+      </w:r>
+      <w:r>
+        <w:t xml:space="preserve">En ese modo la franja de arriba desaparece, y en la franja están «Abrir como Rosa» y el PIN de respaldo de la escena 11. Con la franja visible todo queda a un clic, y el distintivo «Piloto académico con datos de prueba» se ve igual.</w:t>
       </w:r>
     </w:p>
     <w:p>
@@ -1726,7 +1746,7 @@
         <w:t xml:space="preserve">Haz: </w:t>
       </w:r>
       <w:r>
-        <w:t xml:space="preserve">Guía, escena 10. Muestra el enlace y el PIN. El PIN también queda en la franja del presentador.</w:t>
+        <w:t xml:space="preserve">Guía, escena 10. Muestra el enlace y el PIN en la pantalla. El PIN es siempre 4821. Todavía no está en la franja: aparece recién en la escena 11.</w:t>
       </w:r>
     </w:p>
     <w:p>
@@ -1802,7 +1822,7 @@
         <w:t xml:space="preserve">Haz: </w:t>
       </w:r>
       <w:r>
-        <w:t xml:space="preserve">Clic en «Abrir como Rosa» en la franja. Señala el aviso «Tus datos en MATU». Escribe el PIN de la franja y clic en «Ver la ficha». Muestra la hoja un segundo.</w:t>
+        <w:t xml:space="preserve">Clic en «Abrir como Rosa» en la franja de arriba. Baja un poco con la rueda del mouse antes de señalar el aviso «Tus datos en MATU», que a 1280×720 queda bajo el borde. Escribe el PIN 4821, que ahora también está en la franja, y clic en «Ver la ficha». Muestra la hoja un segundo.</w:t>
       </w:r>
     </w:p>
     <w:p>
@@ -1970,7 +1990,7 @@
         <w:t xml:space="preserve">Di: </w:t>
       </w:r>
       <w:r>
-        <w:t xml:space="preserve">«Capa 2. Cada insumo es una barra que termina el día en que se acaba: lo que queda dividido por lo que usa al día. Va ordenado por urgencia, con palabra y no solo con color. La lista de reposición se exporta gratis.»</w:t>
+        <w:t xml:space="preserve">«Capa 2. Cada insumo es una barra que termina el día en que se acaba: lo que queda dividido por lo que usa al día. Va ordenado por urgencia, con palabra y no solo con color. Y la lista de reposición se exporta gratis.»</w:t>
       </w:r>
     </w:p>
     <w:p>
@@ -1990,7 +2010,7 @@
           <w:b/>
           <w:bCs/>
         </w:rPr>
-        <w:t xml:space="preserve">La fecha en que se acaba, de un vistazo.</w:t>
+        <w:t xml:space="preserve">La fecha en que se acaba, de un vistazo. Lo de exportar la lista solo se dice: el botón está en la escena 20 y no se muestra.</w:t>
       </w:r>
     </w:p>
     <w:p>
@@ -2161,7 +2181,7 @@
         <w:t xml:space="preserve">El PIN no entra: </w:t>
       </w:r>
       <w:r>
-        <w:t xml:space="preserve">el PIN correcto está en la franja del presentador. Si no, salta a la escena 12, «Relevo: la ficha».</w:t>
+        <w:t xml:space="preserve">es siempre 4821, y desde la escena 11 también está en la franja. Si no, salta a la escena 12, «Relevo: la ficha».</w:t>
       </w:r>
     </w:p>
     <w:p>

</xml_diff>